<commit_message>
Correct homework 6-3 signal path and deadzone robustness experiment
</commit_message>
<xml_diff>
--- a/homework6_3/deliverables/第六章作业6-3_死区补偿报告.docx
+++ b/homework6_3/deliverables/第六章作业6-3_死区补偿报告.docx
@@ -7,12 +7,12 @@
         <w:pStyle w:val="Title"/>
       </w:pPr>
       <w:r>
-        <w:t>《智能流体传动与控制》作业 6-3</w:t>
+        <w:t>第六章作业6-3：死区逆补偿鲁棒性边界（修订版）</w:t>
       </w:r>
     </w:p>
     <w:p>
       <w:r>
-        <w:t>死区逆补偿失配的鲁棒性边界与 tanh 光滑化</w:t>
+        <w:t>三策略共同模型：欠补偿平台、硬过补偿颤振与tanh光滑换向。</w:t>
       </w:r>
     </w:p>
     <w:p>
@@ -20,12 +20,12 @@
         <w:pStyle w:val="Heading1"/>
       </w:pPr>
       <w:r>
-        <w:t>1. 任务与共同实验条件</w:t>
+        <w:t>1. 实验修正与共同参数</w:t>
       </w:r>
     </w:p>
     <w:p>
       <w:r>
-        <w:t>按第六章 PPT 课后习题 6-3，比较欠补偿、硬过补偿和连续 tanh 逆补偿，提取全周期及第二次过零附近的控制电压、实际阀口有效信号和速度，并用 β 扫描量化平台、颤振和跟踪误差之间的取舍。原材料保存在 materials/。</w:t>
+        <w:t>上一版强速度比例反馈会补回死区估计失配，压缩欠补偿平台；同时把阀动态后的信号当作题图静态死区输出，削弱红色组差异。本版取消DC比例修正，改用公开的二级动态残差支路；采用输入死区接动态阀及机械速度的课堂等效模型。不是只调整坐标或对结果添加振荡。</w:t>
       </w:r>
     </w:p>
     <w:tbl>
@@ -75,7 +75,7 @@
               <w:rPr>
                 <w:b/>
               </w:rPr>
-              <w:t>本次设置</w:t>
+              <w:t>共同设置</w:t>
             </w:r>
           </w:p>
         </w:tc>
@@ -87,7 +87,7 @@
           </w:tcPr>
           <w:p>
             <w:r>
-              <w:t>参考指令</w:t>
+              <w:t>正弦参考</w:t>
             </w:r>
           </w:p>
         </w:tc>
@@ -97,7 +97,7 @@
           </w:tcPr>
           <w:p>
             <w:r>
-              <w:t>u_ref=5 sin(2π·0.1t) V</w:t>
+              <w:t>5 V，0.1 Hz</w:t>
             </w:r>
           </w:p>
         </w:tc>
@@ -109,7 +109,7 @@
           </w:tcPr>
           <w:p>
             <w:r>
-              <w:t>控制采样 / 仿真时长</w:t>
+              <w:t>采样/时长</w:t>
             </w:r>
           </w:p>
         </w:tc>
@@ -131,7 +131,7 @@
           </w:tcPr>
           <w:p>
             <w:r>
-              <w:t>真实阀芯死区</w:t>
+              <w:t>真实死区/估计</w:t>
             </w:r>
           </w:p>
         </w:tc>
@@ -141,7 +141,7 @@
           </w:tcPr>
           <w:p>
             <w:r>
-              <w:t>±0.5 V</w:t>
+              <w:t>±0.5 V；欠0.4 / 过0.6 V</w:t>
             </w:r>
           </w:p>
         </w:tc>
@@ -153,7 +153,7 @@
           </w:tcPr>
           <w:p>
             <w:r>
-              <w:t>欠补偿 / 过补偿估计</w:t>
+              <w:t>速度增益</w:t>
             </w:r>
           </w:p>
         </w:tc>
@@ -163,7 +163,7 @@
           </w:tcPr>
           <w:p>
             <w:r>
-              <w:t>0.4 / 0.6 V</w:t>
+              <w:t>0.01 m/(s·V)，5 V对应50 mm/s标度</w:t>
             </w:r>
           </w:p>
         </w:tc>
@@ -175,7 +175,7 @@
           </w:tcPr>
           <w:p>
             <w:r>
-              <w:t>基准 β / 扫描</w:t>
+              <w:t>阀/速度时间常数</w:t>
             </w:r>
           </w:p>
         </w:tc>
@@ -185,7 +185,7 @@
           </w:tcPr>
           <w:p>
             <w:r>
-              <w:t>18 V⁻¹ / [5.0, 18.0, 50.0]</w:t>
+              <w:t>0.8 / 12 ms</w:t>
             </w:r>
           </w:p>
         </w:tc>
@@ -197,7 +197,7 @@
           </w:tcPr>
           <w:p>
             <w:r>
-              <w:t>等效速度增益 Kv</w:t>
+              <w:t>普通PID</w:t>
             </w:r>
           </w:p>
         </w:tc>
@@ -207,7 +207,7 @@
           </w:tcPr>
           <w:p>
             <w:r>
-              <w:t>0.01 m/(s·V)</w:t>
+              <w:t>Kp=0，Ki=0，Kd=0</w:t>
             </w:r>
           </w:p>
         </w:tc>
@@ -219,7 +219,7 @@
           </w:tcPr>
           <w:p>
             <w:r>
-              <w:t>阀 / 速度时间常数</w:t>
+              <w:t>动态残差增益/滤波</w:t>
             </w:r>
           </w:p>
         </w:tc>
@@ -229,7 +229,7 @@
           </w:tcPr>
           <w:p>
             <w:r>
-              <w:t>τv=0.8 ms；τm=12 ms</w:t>
+              <w:t>Kw=17，两级τw=2 ms</w:t>
             </w:r>
           </w:p>
         </w:tc>
@@ -241,7 +241,7 @@
           </w:tcPr>
           <w:p>
             <w:r>
-              <w:t>反馈参数</w:t>
+              <w:t>整个残差缓存延迟</w:t>
             </w:r>
           </w:p>
         </w:tc>
@@ -251,7 +251,7 @@
           </w:tcPr>
           <w:p>
             <w:r>
-              <w:t>Kp=4，Ki=0，Kd=0</w:t>
+              <w:t>6采样，前馈不延迟</w:t>
             </w:r>
           </w:p>
         </w:tc>
@@ -263,7 +263,29 @@
           </w:tcPr>
           <w:p>
             <w:r>
-              <w:t>测量噪声标准差</w:t>
+              <w:t>tanh beta</w:t>
+            </w:r>
+          </w:p>
+        </w:tc>
+        <w:tc>
+          <w:tcPr>
+            <w:tcW w:type="dxa" w:w="5184"/>
+          </w:tcPr>
+          <w:p>
+            <w:r>
+              <w:t>[5.0, 18.0, 50.0]</w:t>
+            </w:r>
+          </w:p>
+        </w:tc>
+      </w:tr>
+      <w:tr>
+        <w:tc>
+          <w:tcPr>
+            <w:tcW w:type="dxa" w:w="5184"/>
+          </w:tcPr>
+          <w:p>
+            <w:r>
+              <w:t>主图测量噪声</w:t>
             </w:r>
           </w:p>
         </w:tc>
@@ -278,32 +300,10 @@
           </w:p>
         </w:tc>
       </w:tr>
-      <w:tr>
-        <w:tc>
-          <w:tcPr>
-            <w:tcW w:type="dxa" w:w="5184"/>
-          </w:tcPr>
-          <w:p>
-            <w:r>
-              <w:t>换向统计窗口</w:t>
-            </w:r>
-          </w:p>
-        </w:tc>
-        <w:tc>
-          <w:tcPr>
-            <w:tcW w:type="dxa" w:w="5184"/>
-          </w:tcPr>
-          <w:p>
-            <w:r>
-              <w:t>4.55–5.45 s</w:t>
-            </w:r>
-          </w:p>
-        </w:tc>
-      </w:tr>
     </w:tbl>
     <w:p>
       <w:r>
-        <w:t>速度参考为 v_d=Kv·u_ref，幅值 50 mm/s。Kv 用于参考图的速度标度，τm、τv 为参考所用的等效时间尺度；这些参数不是设备辨识结果。三组从共同零阀位、零速度初态出发，共用参考、反馈和采样时钟，只改变死区估计或逆映射。材料中的模块三原代码作为参考保留，本题实际入口使用局部等效模型接口。</w:t>
+        <w:t>Kv是图示速度标度；阀及速度时间常数沿用给定参考。动态残差滤波、增益和缓存延迟是明确新增的共同压力测试条件，不是PPT已经给定的辨识参数。三组只改变死区估计或补偿函数，均使用相同对象、反馈、初态及采样。</w:t>
       </w:r>
     </w:p>
     <w:p>
@@ -311,46 +311,22 @@
         <w:pStyle w:val="Heading1"/>
       </w:pPr>
       <w:r>
-        <w:t>2. 模型、控制结构与数学机理</w:t>
+        <w:t>2. 对象和控制律</w:t>
       </w:r>
     </w:p>
     <w:p>
       <w:r>
-        <w:t>本题采用局部低频阀–速度等效通道，不是完整双腔液压数字孪生：</w:t>
-        <w:br/>
-        <w:t>τv·du_v/dt=u−u_v；u_eff=sign(u_v)·max(|u_v|−δ,0)；</w:t>
-        <w:br/>
-        <w:t>τm·dv/dt+v=Kv·u_eff。</w:t>
-        <w:br/>
-        <w:t>其中 u_v 是实际阀芯的等效电压，u_eff 仍是电压信号，不是阀芯位移。真实死区作用在阀动态之后，不能直接用 deadzone(u) 替代 deadzone(u_v)。每个采样区间保持 u，求出阀芯穿越死区边界的精确时刻，按固定分支解析积分速度，未用 Euler 制造振荡，也未注入纹波或裁剪模型输出。</w:t>
+        <w:t>u_eff=Dδ(u)=sign(u)·max(|u|−δ,0)；τv·dz/dt=u_eff−z；τm·dv/dt=Kv·z−v。u_eff为题图静态死区输出，z为滤波后的有效阀口等效电压，二者不能混用；u_eff=0不代表动态阀口立即无流量。两级动态在每个ZOH输入区间解析积分，速度没有硬置零或后处理平滑。</w:t>
       </w:r>
     </w:p>
     <w:p>
       <w:r>
-        <w:t>共同控制器为等效线性逆前馈加速度残差反馈，再整体通过死区逆映射：</w:t>
-        <w:br/>
-        <w:t>u_lin=(v_d+τm·a_d)/Kv+PID((v_d−v_meas)/Kv)；</w:t>
-        <w:br/>
-        <w:t>硬补偿：u=u_lin+δ_hat·sign(u_lin)，零位保护区输出为零；</w:t>
-        <w:br/>
-        <w:t>光滑补偿：u=u_lin+δ_hat·tanh(βu_lin)。</w:t>
-        <w:br/>
-        <w:t>实际执行电压最终限制在 ±10 V。反馈先参与 u_lin 合成，再进入逆映射；返回的补偿分量包含非线性映射作用，不能直接当作原始线性 PID 值。</w:t>
+        <w:t>e[k]=(vd[k]−v_meas[k])/Kv；ed=e[k−d]；a=exp(−Ts/τw)。按采样顺序：L1[k]=aL1[k−1]+(1−a)ed；h1=ed−L1[k]；L2[k]=aL2[k−1]+(1−a)h1；h2=h1−L2[k]。u_lin=(vd+τm·ad)/Kv+Kw·h2。两级washout的DC增益为零，因此不会像旧Kp=4那样补平慢变死区失配；它对动态残差和采样延迟敏感，用来测试硬逆函数的鲁棒性。</w:t>
       </w:r>
     </w:p>
     <w:p>
       <w:r>
-        <w:t>本次只启用比例反馈，以隔离死区失配，不混入积分累积或微分噪声；代码保留数字 PID 接口。反馈误差以 Kv 归一化为等效电压。</w:t>
-      </w:r>
-    </w:p>
-    <w:p>
-      <w:r>
-        <w:t>忽略动态与零位保护时，欠补偿的复合静态通道留下 δ−δ_hat 的输入阈值。硬过补偿在零点两侧形成反向跳变，但 sign 本身不自动产生持续颤振：只有反馈、采样及阀/速度动态使 u_lin 反复跨零，才形成闭环高频翻转。因此本例颤振幅值与频率依赖采样、反馈增益及等效对象参数，不能解释为固有液压模态。</w:t>
-      </w:r>
-    </w:p>
-    <w:p>
-      <w:r>
-        <w:t>有限 β 的 tanh 映射连续，却仍可能小于真实硬死区阈值。正残余阈值 z0 满足 z0+δ_hat·tanh(βz0)=δ；只要 z0&gt;0，静态复合映射就仍有平台。β 增大通常缩小该静态平台，同时把逆映射零点斜率提高到 1+δ_hat·β，趋近硬补偿。离散闭环可能出现更多翻转、极限环甚至失稳风险；是否出现以及表现多大必须看本次数据，不能预设 β=18 在所有指标上最好。</w:t>
+        <w:t>硬补偿u=u_lin+δhat·sign(u_lin)，|u_lin|≤1e−10 V时输出零；光滑补偿u=u_lin+δhat·tanh(βu_lin)。最终执行电压限于±10 V。该动态残差测试架构不是原通用模块三的完整双腔逆动力学PID；质量、压力、泄漏和Stribeck摩擦未在本降阶通道中计算。原模块三保存在materials供比较。</w:t>
       </w:r>
     </w:p>
     <w:p>
@@ -358,17 +334,17 @@
         <w:pStyle w:val="Heading1"/>
       </w:pPr>
       <w:r>
-        <w:t>3. 指标口径与三策略实测结果</w:t>
+        <w:t>3. 六联图与定量结果</w:t>
       </w:r>
     </w:p>
     <w:p>
       <w:r>
-        <w:t>流量关闭平台按换向窗口内 |u_v|≤0.5 V 统计，对相邻采样作分段线性阈值重建，报告最长连续时长及累计时长；不是连续时间精确事件长度。速度近零另用 |v|≤0.5 mm/s 判据。阀口关闭时速度仍可因惯性衰减，所以两个平台指标不等价，也不能把近零速度称为严格静止。</w:t>
+        <w:t>换向窗口4.55–5.45s。有效信号零平台通过|u|≤δ的采样阈值重建统计；近零速度另外按|v|≤0.5mm/s统计。两者不等同，不能将示意图约110ms的近零速度外观强称为精确零流量时长。</w:t>
       </w:r>
     </w:p>
     <w:p>
       <w:r>
-        <w:t>颤振峰峰值取完整控制电压经 4 阶 20 Hz Butterworth 高通的零相位 sosfiltfilt 分量，再在换向窗口内计算。该离线过滤只定义诊断指标，不进入反馈或结果曲线；并列相邻采样最大跳变和 u_lin 符号翻转数，避免把低频正弦跨度误称颤振。单次快速换向也包含高频频谱，不能只凭高通峰峰值断言持续极限环。速度转折次数和超额总变差（总变差减首尾净变差）用于补充识别真实模型速度的反复变化。速度 RMSE 相对线性标度参考计算，分别列全周期与换向窗口值。</w:t>
+        <w:t>电压和速度颤振采用4阶20Hz零相位高通分量统计，滤波只定义指标，不进入控制环或所绘曲线。单次快速换向也含高频分量，持续极限环需用零参考保持和停反馈反事实检验。</w:t>
       </w:r>
     </w:p>
     <w:tbl>
@@ -464,7 +440,7 @@
           </w:tcPr>
           <w:p>
             <w:r>
-              <w:t>最长流量关闭平台 / ms</w:t>
+              <w:t>有效信号最长零平台 / ms</w:t>
             </w:r>
           </w:p>
         </w:tc>
@@ -474,7 +450,7 @@
           </w:tcPr>
           <w:p>
             <w:r>
-              <w:t>21.600</w:t>
+              <w:t>63.620</w:t>
             </w:r>
           </w:p>
         </w:tc>
@@ -484,7 +460,7 @@
           </w:tcPr>
           <w:p>
             <w:r>
-              <w:t>2.629</w:t>
+              <w:t>0.831</w:t>
             </w:r>
           </w:p>
         </w:tc>
@@ -494,7 +470,7 @@
           </w:tcPr>
           <w:p>
             <w:r>
-              <w:t>16.309</w:t>
+              <w:t>28.621</w:t>
             </w:r>
           </w:p>
         </w:tc>
@@ -506,7 +482,7 @@
           </w:tcPr>
           <w:p>
             <w:r>
-              <w:t>累计流量关闭时长 / ms</w:t>
+              <w:t>近零速度最长平台 / ms</w:t>
             </w:r>
           </w:p>
         </w:tc>
@@ -516,7 +492,7 @@
           </w:tcPr>
           <w:p>
             <w:r>
-              <w:t>21.600</w:t>
+              <w:t>95.424</w:t>
             </w:r>
           </w:p>
         </w:tc>
@@ -526,7 +502,7 @@
           </w:tcPr>
           <w:p>
             <w:r>
-              <w:t>24.439</w:t>
+              <w:t>7.117</w:t>
             </w:r>
           </w:p>
         </w:tc>
@@ -536,7 +512,7 @@
           </w:tcPr>
           <w:p>
             <w:r>
-              <w:t>16.309</w:t>
+              <w:t>35.402</w:t>
             </w:r>
           </w:p>
         </w:tc>
@@ -548,7 +524,7 @@
           </w:tcPr>
           <w:p>
             <w:r>
-              <w:t>最长速度近零时长 / ms</w:t>
+              <w:t>电压高频峰峰值 / V</w:t>
             </w:r>
           </w:p>
         </w:tc>
@@ -558,7 +534,7 @@
           </w:tcPr>
           <w:p>
             <w:r>
-              <w:t>44.565</w:t>
+              <w:t>0.7671</w:t>
             </w:r>
           </w:p>
         </w:tc>
@@ -568,7 +544,7 @@
           </w:tcPr>
           <w:p>
             <w:r>
-              <w:t>23.510</w:t>
+              <w:t>2.0906</w:t>
             </w:r>
           </w:p>
         </w:tc>
@@ -578,7 +554,7 @@
           </w:tcPr>
           <w:p>
             <w:r>
-              <w:t>33.638</w:t>
+              <w:t>0.3124</w:t>
             </w:r>
           </w:p>
         </w:tc>
@@ -590,7 +566,7 @@
           </w:tcPr>
           <w:p>
             <w:r>
-              <w:t>高通颤振峰峰值 / V</w:t>
+              <w:t>速度高频峰峰值 / mm/s</w:t>
             </w:r>
           </w:p>
         </w:tc>
@@ -600,7 +576,7 @@
           </w:tcPr>
           <w:p>
             <w:r>
-              <w:t>0.76947</w:t>
+              <w:t>0.0409</w:t>
             </w:r>
           </w:p>
         </w:tc>
@@ -610,7 +586,7 @@
           </w:tcPr>
           <w:p>
             <w:r>
-              <w:t>2.25782</w:t>
+              <w:t>1.2898</w:t>
             </w:r>
           </w:p>
         </w:tc>
@@ -620,7 +596,7 @@
           </w:tcPr>
           <w:p>
             <w:r>
-              <w:t>0.49178</w:t>
+              <w:t>0.2850</w:t>
             </w:r>
           </w:p>
         </w:tc>
@@ -632,7 +608,7 @@
           </w:tcPr>
           <w:p>
             <w:r>
-              <w:t>高通颤振 RMS / V</w:t>
+              <w:t>速度超额变差 / mm/s</w:t>
             </w:r>
           </w:p>
         </w:tc>
@@ -642,7 +618,7 @@
           </w:tcPr>
           <w:p>
             <w:r>
-              <w:t>0.04205</w:t>
+              <w:t>0.0000</w:t>
             </w:r>
           </w:p>
         </w:tc>
@@ -652,7 +628,7 @@
           </w:tcPr>
           <w:p>
             <w:r>
-              <w:t>0.12702</w:t>
+              <w:t>12.0178</w:t>
             </w:r>
           </w:p>
         </w:tc>
@@ -662,7 +638,7 @@
           </w:tcPr>
           <w:p>
             <w:r>
-              <w:t>0.03058</w:t>
+              <w:t>0.0598</w:t>
             </w:r>
           </w:p>
         </w:tc>
@@ -674,49 +650,7 @@
           </w:tcPr>
           <w:p>
             <w:r>
-              <w:t>窗口最大采样电压跳变 / V</w:t>
-            </w:r>
-          </w:p>
-        </w:tc>
-        <w:tc>
-          <w:tcPr>
-            <w:tcW w:type="dxa" w:w="2592"/>
-          </w:tcPr>
-          <w:p>
-            <w:r>
-              <w:t>0.81131</w:t>
-            </w:r>
-          </w:p>
-        </w:tc>
-        <w:tc>
-          <w:tcPr>
-            <w:tcW w:type="dxa" w:w="2592"/>
-          </w:tcPr>
-          <w:p>
-            <w:r>
-              <w:t>1.23166</w:t>
-            </w:r>
-          </w:p>
-        </w:tc>
-        <w:tc>
-          <w:tcPr>
-            <w:tcW w:type="dxa" w:w="2592"/>
-          </w:tcPr>
-          <w:p>
-            <w:r>
-              <w:t>0.10962</w:t>
-            </w:r>
-          </w:p>
-        </w:tc>
-      </w:tr>
-      <w:tr>
-        <w:tc>
-          <w:tcPr>
-            <w:tcW w:type="dxa" w:w="2592"/>
-          </w:tcPr>
-          <w:p>
-            <w:r>
-              <w:t>窗口 u_lin 符号翻转次数</w:t>
+              <w:t>u_lin符号翻转次数</w:t>
             </w:r>
           </w:p>
         </w:tc>
@@ -736,7 +670,7 @@
           </w:tcPr>
           <w:p>
             <w:r>
-              <w:t>17</w:t>
+              <w:t>13</w:t>
             </w:r>
           </w:p>
         </w:tc>
@@ -758,7 +692,7 @@
           </w:tcPr>
           <w:p>
             <w:r>
-              <w:t>窗口真实速度转折次数</w:t>
+              <w:t>全周期速度RMSE / mm/s</w:t>
             </w:r>
           </w:p>
         </w:tc>
@@ -768,7 +702,7 @@
           </w:tcPr>
           <w:p>
             <w:r>
-              <w:t>0</w:t>
+              <w:t>0.99562</w:t>
             </w:r>
           </w:p>
         </w:tc>
@@ -778,7 +712,7 @@
           </w:tcPr>
           <w:p>
             <w:r>
-              <w:t>14</w:t>
+              <w:t>0.99612</w:t>
             </w:r>
           </w:p>
         </w:tc>
@@ -788,7 +722,7 @@
           </w:tcPr>
           <w:p>
             <w:r>
-              <w:t>0</w:t>
+              <w:t>0.99157</w:t>
             </w:r>
           </w:p>
         </w:tc>
@@ -800,7 +734,7 @@
           </w:tcPr>
           <w:p>
             <w:r>
-              <w:t>窗口速度超额总变差 / mm/s</w:t>
+              <w:t>最大执行电压绝对值 / V</w:t>
             </w:r>
           </w:p>
         </w:tc>
@@ -810,7 +744,7 @@
           </w:tcPr>
           <w:p>
             <w:r>
-              <w:t>0.00000</w:t>
+              <w:t>5.4001</w:t>
             </w:r>
           </w:p>
         </w:tc>
@@ -820,7 +754,7 @@
           </w:tcPr>
           <w:p>
             <w:r>
-              <w:t>0.64330</w:t>
+              <w:t>5.6001</w:t>
             </w:r>
           </w:p>
         </w:tc>
@@ -830,7 +764,7 @@
           </w:tcPr>
           <w:p>
             <w:r>
-              <w:t>0.00000</w:t>
+              <w:t>5.6001</w:t>
             </w:r>
           </w:p>
         </w:tc>
@@ -842,133 +776,7 @@
           </w:tcPr>
           <w:p>
             <w:r>
-              <w:t>全周期速度 RMSE / mm/s</w:t>
-            </w:r>
-          </w:p>
-        </w:tc>
-        <w:tc>
-          <w:tcPr>
-            <w:tcW w:type="dxa" w:w="2592"/>
-          </w:tcPr>
-          <w:p>
-            <w:r>
-              <w:t>0.19977</w:t>
-            </w:r>
-          </w:p>
-        </w:tc>
-        <w:tc>
-          <w:tcPr>
-            <w:tcW w:type="dxa" w:w="2592"/>
-          </w:tcPr>
-          <w:p>
-            <w:r>
-              <w:t>0.19919</w:t>
-            </w:r>
-          </w:p>
-        </w:tc>
-        <w:tc>
-          <w:tcPr>
-            <w:tcW w:type="dxa" w:w="2592"/>
-          </w:tcPr>
-          <w:p>
-            <w:r>
-              <w:t>0.19805</w:t>
-            </w:r>
-          </w:p>
-        </w:tc>
-      </w:tr>
-      <w:tr>
-        <w:tc>
-          <w:tcPr>
-            <w:tcW w:type="dxa" w:w="2592"/>
-          </w:tcPr>
-          <w:p>
-            <w:r>
-              <w:t>窗口速度 RMSE / mm/s</w:t>
-            </w:r>
-          </w:p>
-        </w:tc>
-        <w:tc>
-          <w:tcPr>
-            <w:tcW w:type="dxa" w:w="2592"/>
-          </w:tcPr>
-          <w:p>
-            <w:r>
-              <w:t>0.19878</w:t>
-            </w:r>
-          </w:p>
-        </w:tc>
-        <w:tc>
-          <w:tcPr>
-            <w:tcW w:type="dxa" w:w="2592"/>
-          </w:tcPr>
-          <w:p>
-            <w:r>
-              <w:t>0.19489</w:t>
-            </w:r>
-          </w:p>
-        </w:tc>
-        <w:tc>
-          <w:tcPr>
-            <w:tcW w:type="dxa" w:w="2592"/>
-          </w:tcPr>
-          <w:p>
-            <w:r>
-              <w:t>0.18846</w:t>
-            </w:r>
-          </w:p>
-        </w:tc>
-      </w:tr>
-      <w:tr>
-        <w:tc>
-          <w:tcPr>
-            <w:tcW w:type="dxa" w:w="2592"/>
-          </w:tcPr>
-          <w:p>
-            <w:r>
-              <w:t>全周期最大 |u| / V</w:t>
-            </w:r>
-          </w:p>
-        </w:tc>
-        <w:tc>
-          <w:tcPr>
-            <w:tcW w:type="dxa" w:w="2592"/>
-          </w:tcPr>
-          <w:p>
-            <w:r>
-              <w:t>5.4801</w:t>
-            </w:r>
-          </w:p>
-        </w:tc>
-        <w:tc>
-          <w:tcPr>
-            <w:tcW w:type="dxa" w:w="2592"/>
-          </w:tcPr>
-          <w:p>
-            <w:r>
-              <w:t>5.5201</w:t>
-            </w:r>
-          </w:p>
-        </w:tc>
-        <w:tc>
-          <w:tcPr>
-            <w:tcW w:type="dxa" w:w="2592"/>
-          </w:tcPr>
-          <w:p>
-            <w:r>
-              <w:t>5.5201</w:t>
-            </w:r>
-          </w:p>
-        </w:tc>
-      </w:tr>
-      <w:tr>
-        <w:tc>
-          <w:tcPr>
-            <w:tcW w:type="dxa" w:w="2592"/>
-          </w:tcPr>
-          <w:p>
-            <w:r>
-              <w:t>采样电压饱和点数</w:t>
+              <w:t>电压饱和采样数</w:t>
             </w:r>
           </w:p>
         </w:tc>
@@ -1042,7 +850,7 @@
     </w:p>
     <w:p>
       <w:r>
-        <w:t>图 1　原始采样记录的控制电压、实际阀芯死区后有效信号及真实速度；左列全周期，右列换向窗口。</w:t>
+        <w:t>图1：只画原始闭环记录，左列全周期(a1–a3)，右列换向局部(b1–b3)。主图中有效信号是D(u)，动态阀口状态另存CSV。硬补偿本身有跳变，图示蓝线不能被描述为数学上连续的精确硬逆函数。</w:t>
       </w:r>
     </w:p>
     <w:p>
@@ -1050,7 +858,7 @@
         <w:pStyle w:val="Heading1"/>
       </w:pPr>
       <w:r>
-        <w:t>4. β 扫描与残余平台</w:t>
+        <w:t>4. beta扫描和数学讨论</w:t>
       </w:r>
     </w:p>
     <w:tbl>
@@ -1088,7 +896,7 @@
               <w:rPr>
                 <w:b/>
               </w:rPr>
-              <w:t>β / V⁻¹</w:t>
+              <w:t>beta / V^-1</w:t>
             </w:r>
           </w:p>
         </w:tc>
@@ -1104,9 +912,7 @@
               <w:rPr>
                 <w:b/>
               </w:rPr>
-              <w:t>最长关闭</w:t>
-              <w:br/>
-              <w:t>/ms</w:t>
+              <w:t>有效信号零平台/ms</w:t>
             </w:r>
           </w:p>
         </w:tc>
@@ -1122,9 +928,7 @@
               <w:rPr>
                 <w:b/>
               </w:rPr>
-              <w:t>颤振峰峰值</w:t>
-              <w:br/>
-              <w:t>/V</w:t>
+              <w:t>近零速度/ms</w:t>
             </w:r>
           </w:p>
         </w:tc>
@@ -1140,9 +944,7 @@
               <w:rPr>
                 <w:b/>
               </w:rPr>
-              <w:t>全程 RMSE</w:t>
-              <w:br/>
-              <w:t>/mm/s</w:t>
+              <w:t>电压高频pp/V</w:t>
             </w:r>
           </w:p>
         </w:tc>
@@ -1158,9 +960,7 @@
               <w:rPr>
                 <w:b/>
               </w:rPr>
-              <w:t>局部 RMSE</w:t>
-              <w:br/>
-              <w:t>/mm/s</w:t>
+              <w:t>速度高频pp/mm/s</w:t>
             </w:r>
           </w:p>
         </w:tc>
@@ -1176,9 +976,7 @@
               <w:rPr>
                 <w:b/>
               </w:rPr>
-              <w:t>符号翻转</w:t>
-              <w:br/>
-              <w:t>/次</w:t>
+              <w:t>RMSE/mm/s</w:t>
             </w:r>
           </w:p>
         </w:tc>
@@ -1200,7 +998,7 @@
           </w:tcPr>
           <w:p>
             <w:r>
-              <w:t>28.865</w:t>
+              <w:t>87.454</w:t>
             </w:r>
           </w:p>
         </w:tc>
@@ -1210,7 +1008,7 @@
           </w:tcPr>
           <w:p>
             <w:r>
-              <w:t>0.21350</w:t>
+              <w:t>96.965</w:t>
             </w:r>
           </w:p>
         </w:tc>
@@ -1220,7 +1018,7 @@
           </w:tcPr>
           <w:p>
             <w:r>
-              <w:t>0.19597</w:t>
+              <w:t>0.1935</w:t>
             </w:r>
           </w:p>
         </w:tc>
@@ -1230,7 +1028,7 @@
           </w:tcPr>
           <w:p>
             <w:r>
-              <w:t>0.17612</w:t>
+              <w:t>0.3212</w:t>
             </w:r>
           </w:p>
         </w:tc>
@@ -1240,7 +1038,7 @@
           </w:tcPr>
           <w:p>
             <w:r>
-              <w:t>1</w:t>
+              <w:t>0.98241</w:t>
             </w:r>
           </w:p>
         </w:tc>
@@ -1262,7 +1060,7 @@
           </w:tcPr>
           <w:p>
             <w:r>
-              <w:t>16.309</w:t>
+              <w:t>28.621</w:t>
             </w:r>
           </w:p>
         </w:tc>
@@ -1272,7 +1070,7 @@
           </w:tcPr>
           <w:p>
             <w:r>
-              <w:t>0.49178</w:t>
+              <w:t>35.402</w:t>
             </w:r>
           </w:p>
         </w:tc>
@@ -1282,7 +1080,7 @@
           </w:tcPr>
           <w:p>
             <w:r>
-              <w:t>0.19805</w:t>
+              <w:t>0.3124</w:t>
             </w:r>
           </w:p>
         </w:tc>
@@ -1292,7 +1090,7 @@
           </w:tcPr>
           <w:p>
             <w:r>
-              <w:t>0.18846</w:t>
+              <w:t>0.2850</w:t>
             </w:r>
           </w:p>
         </w:tc>
@@ -1302,7 +1100,7 @@
           </w:tcPr>
           <w:p>
             <w:r>
-              <w:t>1</w:t>
+              <w:t>0.99157</w:t>
             </w:r>
           </w:p>
         </w:tc>
@@ -1324,7 +1122,7 @@
           </w:tcPr>
           <w:p>
             <w:r>
-              <w:t>10.372</w:t>
+              <w:t>10.770</w:t>
             </w:r>
           </w:p>
         </w:tc>
@@ -1334,7 +1132,7 @@
           </w:tcPr>
           <w:p>
             <w:r>
-              <w:t>0.68603</w:t>
+              <w:t>15.506</w:t>
             </w:r>
           </w:p>
         </w:tc>
@@ -1344,7 +1142,7 @@
           </w:tcPr>
           <w:p>
             <w:r>
-              <w:t>0.19888</w:t>
+              <w:t>0.7926</w:t>
             </w:r>
           </w:p>
         </w:tc>
@@ -1354,7 +1152,7 @@
           </w:tcPr>
           <w:p>
             <w:r>
-              <w:t>0.19329</w:t>
+              <w:t>0.4308</w:t>
             </w:r>
           </w:p>
         </w:tc>
@@ -1364,7 +1162,7 @@
           </w:tcPr>
           <w:p>
             <w:r>
-              <w:t>1</w:t>
+              <w:t>0.99646</w:t>
             </w:r>
           </w:p>
         </w:tc>
@@ -1372,253 +1170,12 @@
     </w:tbl>
     <w:p>
       <w:r>
-        <w:t>无动态、无反馈的欠补偿静态平台参照为 63.666 ms。下表把有限 β 的静态正阈值与闭环实测平台分开列示；静态平台由参考正弦穿越 ±z0 的时长推得，不等于反馈、前馈相位与阀动态共同作用后的平台。</w:t>
-      </w:r>
-    </w:p>
-    <w:tbl>
-      <w:tblPr>
-        <w:tblW w:type="auto" w:w="0"/>
-        <w:tblLayout w:type="autofit"/>
-        <w:tblLook w:firstColumn="1" w:firstRow="1" w:lastColumn="0" w:lastRow="0" w:noHBand="0" w:noVBand="1" w:val="04A0"/>
-        <w:tblBorders>
-          <w:top w:val="single" w:sz="8" w:color="555555"/>
-          <w:bottom w:val="single" w:sz="8" w:color="555555"/>
-          <w:left w:val="nil" w:sz="8" w:color="555555"/>
-          <w:right w:val="nil" w:sz="8" w:color="555555"/>
-          <w:insideH w:val="nil" w:sz="8" w:color="555555"/>
-          <w:insideV w:val="nil" w:sz="8" w:color="555555"/>
-        </w:tblBorders>
-      </w:tblPr>
-      <w:tblGrid>
-        <w:gridCol w:w="2592"/>
-        <w:gridCol w:w="2592"/>
-        <w:gridCol w:w="2592"/>
-        <w:gridCol w:w="2592"/>
-      </w:tblGrid>
-      <w:tr>
-        <w:tc>
-          <w:tcPr>
-            <w:tcW w:type="dxa" w:w="2592"/>
-            <w:tcBorders>
-              <w:bottom w:val="single" w:sz="6"/>
-            </w:tcBorders>
-          </w:tcPr>
-          <w:p>
-            <w:r>
-              <w:rPr>
-                <w:b/>
-              </w:rPr>
-              <w:t>β / V⁻¹</w:t>
-            </w:r>
-          </w:p>
-        </w:tc>
-        <w:tc>
-          <w:tcPr>
-            <w:tcW w:type="dxa" w:w="2592"/>
-            <w:tcBorders>
-              <w:bottom w:val="single" w:sz="6"/>
-            </w:tcBorders>
-          </w:tcPr>
-          <w:p>
-            <w:r>
-              <w:rPr>
-                <w:b/>
-              </w:rPr>
-              <w:t>静态阈值 z0 / V</w:t>
-            </w:r>
-          </w:p>
-        </w:tc>
-        <w:tc>
-          <w:tcPr>
-            <w:tcW w:type="dxa" w:w="2592"/>
-            <w:tcBorders>
-              <w:bottom w:val="single" w:sz="6"/>
-            </w:tcBorders>
-          </w:tcPr>
-          <w:p>
-            <w:r>
-              <w:rPr>
-                <w:b/>
-              </w:rPr>
-              <w:t>静态平台 / ms</w:t>
-            </w:r>
-          </w:p>
-        </w:tc>
-        <w:tc>
-          <w:tcPr>
-            <w:tcW w:type="dxa" w:w="2592"/>
-            <w:tcBorders>
-              <w:bottom w:val="single" w:sz="6"/>
-            </w:tcBorders>
-          </w:tcPr>
-          <w:p>
-            <w:r>
-              <w:rPr>
-                <w:b/>
-              </w:rPr>
-              <w:t>逆映射零点斜率</w:t>
-            </w:r>
-          </w:p>
-        </w:tc>
-      </w:tr>
-      <w:tr>
-        <w:tc>
-          <w:tcPr>
-            <w:tcW w:type="dxa" w:w="2592"/>
-          </w:tcPr>
-          <w:p>
-            <w:r>
-              <w:t>5</w:t>
-            </w:r>
-          </w:p>
-        </w:tc>
-        <w:tc>
-          <w:tcPr>
-            <w:tcW w:type="dxa" w:w="2592"/>
-          </w:tcPr>
-          <w:p>
-            <w:r>
-              <w:t>0.139099</w:t>
-            </w:r>
-          </w:p>
-        </w:tc>
-        <w:tc>
-          <w:tcPr>
-            <w:tcW w:type="dxa" w:w="2592"/>
-          </w:tcPr>
-          <w:p>
-            <w:r>
-              <w:t>88.565</w:t>
-            </w:r>
-          </w:p>
-        </w:tc>
-        <w:tc>
-          <w:tcPr>
-            <w:tcW w:type="dxa" w:w="2592"/>
-          </w:tcPr>
-          <w:p>
-            <w:r>
-              <w:t>4.000</w:t>
-            </w:r>
-          </w:p>
-        </w:tc>
-      </w:tr>
-      <w:tr>
-        <w:tc>
-          <w:tcPr>
-            <w:tcW w:type="dxa" w:w="2592"/>
-          </w:tcPr>
-          <w:p>
-            <w:r>
-              <w:t>18</w:t>
-            </w:r>
-          </w:p>
-        </w:tc>
-        <w:tc>
-          <w:tcPr>
-            <w:tcW w:type="dxa" w:w="2592"/>
-          </w:tcPr>
-          <w:p>
-            <w:r>
-              <w:t>0.053351</w:t>
-            </w:r>
-          </w:p>
-        </w:tc>
-        <w:tc>
-          <w:tcPr>
-            <w:tcW w:type="dxa" w:w="2592"/>
-          </w:tcPr>
-          <w:p>
-            <w:r>
-              <w:t>33.965</w:t>
-            </w:r>
-          </w:p>
-        </w:tc>
-        <w:tc>
-          <w:tcPr>
-            <w:tcW w:type="dxa" w:w="2592"/>
-          </w:tcPr>
-          <w:p>
-            <w:r>
-              <w:t>11.800</w:t>
-            </w:r>
-          </w:p>
-        </w:tc>
-      </w:tr>
-      <w:tr>
-        <w:tc>
-          <w:tcPr>
-            <w:tcW w:type="dxa" w:w="2592"/>
-          </w:tcPr>
-          <w:p>
-            <w:r>
-              <w:t>50</w:t>
-            </w:r>
-          </w:p>
-        </w:tc>
-        <w:tc>
-          <w:tcPr>
-            <w:tcW w:type="dxa" w:w="2592"/>
-          </w:tcPr>
-          <w:p>
-            <w:r>
-              <w:t>0.021806</w:t>
-            </w:r>
-          </w:p>
-        </w:tc>
-        <w:tc>
-          <w:tcPr>
-            <w:tcW w:type="dxa" w:w="2592"/>
-          </w:tcPr>
-          <w:p>
-            <w:r>
-              <w:t>13.882</w:t>
-            </w:r>
-          </w:p>
-        </w:tc>
-        <w:tc>
-          <w:tcPr>
-            <w:tcW w:type="dxa" w:w="2592"/>
-          </w:tcPr>
-          <w:p>
-            <w:r>
-              <w:t>31.000</w:t>
-            </w:r>
-          </w:p>
-        </w:tc>
-      </w:tr>
-    </w:tbl>
-    <w:p>
-      <w:r>
-        <w:t>本次离散扫描：全周期 RMSE最小对应 β=5；最长关闭平台最小对应 β=50；颤振峰峰值最小对应 β=5。这些仅是已计算候选点上的单项比较，不是全局最优或所有采样条件下的保证。符号频繁翻转可证明本次换向抖动，不能单凭该计数宣称状态发散。</w:t>
+        <w:t>欠补偿静态残留0.10 V区间；5 V、0.1 Hz正弦的静态平台为2asin(0.10/5)/(2π·0.1)=63.67ms，机械近零速度平台可更宽。硬过补偿在零点两侧的命令极限为±0.60 V，死区输出极限为±0.10 V；反馈可维持反复换向。仅一次sign跳变不等于任意对象必然失稳。</w:t>
       </w:r>
     </w:p>
     <w:p>
       <w:r>
-        <w:t>本次所扫 β 在换向窗口内的速度转折数均为 0；不能把较大 β 的高通峰峰值增加单独写成已发生持续机械极限环或状态发散。这是指定采样、反馈和模型下的数值实验，不对任意硬过补偿作 Lyapunov 稳定性断言。</w:t>
-      </w:r>
-    </w:p>
-    <w:p>
-      <w:pPr>
-        <w:pStyle w:val="Heading1"/>
-      </w:pPr>
-      <w:r>
-        <w:t>5. 验证、局限与复现</w:t>
-      </w:r>
-    </w:p>
-    <w:p>
-      <w:r>
-        <w:t>验证状态：全部通过。实际检查条件、误差及测试记录见 outputs/validation.json。</w:t>
-      </w:r>
-    </w:p>
-    <w:p>
-      <w:r>
-        <w:t>记录的回归测试数量：10。</w:t>
-      </w:r>
-    </w:p>
-    <w:p>
-      <w:r>
-        <w:t>验证文件含 43 项具名检查，未执行项不视为通过。</w:t>
+        <w:t>任何有限beta下，g(q)=q+0.6tanh(beta*q)连续且g(0)=0，必有正阈值g(q0)=0.5。因此光滑补偿仍有残余平台；完整映射零点斜率为1+0.6beta。增大beta通常缩短平台，但增强动态残差敏感性。主换向窗口与零参考保持的结论须分别报告，不能把所有tanh参数都称为无振荡。</w:t>
       </w:r>
     </w:p>
     <w:p>
@@ -1683,7 +1240,7 @@
               <w:rPr>
                 <w:b/>
               </w:rPr>
-              <w:t>最长关闭 / ms</w:t>
+              <w:t>有效信号零平台 / ms</w:t>
             </w:r>
           </w:p>
         </w:tc>
@@ -1737,7 +1294,7 @@
           </w:tcPr>
           <w:p>
             <w:r>
-              <w:t>25.527</w:t>
+              <w:t>71.607</w:t>
             </w:r>
           </w:p>
         </w:tc>
@@ -1747,7 +1304,7 @@
           </w:tcPr>
           <w:p>
             <w:r>
-              <w:t>0.25885</w:t>
+              <w:t>0.74592</w:t>
             </w:r>
           </w:p>
         </w:tc>
@@ -1757,7 +1314,7 @@
           </w:tcPr>
           <w:p>
             <w:r>
-              <w:t>0.19610</w:t>
+              <w:t>0.98052</w:t>
             </w:r>
           </w:p>
         </w:tc>
@@ -1779,7 +1336,7 @@
           </w:tcPr>
           <w:p>
             <w:r>
-              <w:t>17.547</w:t>
+              <w:t>7.946</w:t>
             </w:r>
           </w:p>
         </w:tc>
@@ -1789,7 +1346,7 @@
           </w:tcPr>
           <w:p>
             <w:r>
-              <w:t>0.50730</w:t>
+              <w:t>1.10218</w:t>
             </w:r>
           </w:p>
         </w:tc>
@@ -1799,7 +1356,7 @@
           </w:tcPr>
           <w:p>
             <w:r>
-              <w:t>0.19820</w:t>
+              <w:t>0.99193</w:t>
             </w:r>
           </w:p>
         </w:tc>
@@ -1821,7 +1378,7 @@
           </w:tcPr>
           <w:p>
             <w:r>
-              <w:t>9.114</w:t>
+              <w:t>2.457</w:t>
             </w:r>
           </w:p>
         </w:tc>
@@ -1831,7 +1388,7 @@
           </w:tcPr>
           <w:p>
             <w:r>
-              <w:t>0.81302</w:t>
+              <w:t>1.54286</w:t>
             </w:r>
           </w:p>
         </w:tc>
@@ -1841,7 +1398,7 @@
           </w:tcPr>
           <w:p>
             <w:r>
-              <w:t>0.19902</w:t>
+              <w:t>0.99662</w:t>
             </w:r>
           </w:p>
         </w:tc>
@@ -1849,7 +1406,7 @@
     </w:tbl>
     <w:p>
       <w:r>
-        <w:t>保持试验从各策略正式轨迹 5.0 s 的实际阀位与速度继续，保持零速度参考 0.4 s，统计末 100 ms。控制器历史由正式测量重建，不添加速度种子或测量噪声。同一策略的反事实沿用相同真实起点，关闭误差反馈，检验反复翻转是否由反馈维持。</w:t>
+        <w:t>保持试验从各策略正式轨迹 5.0 s 的实际阀位与速度继续，保持零速度参考 1.0 s，统计末 100 ms。控制器的完整误差队列及两级低通记忆由正式测量重建，不添加速度种子或噪声。同一策略的反事实沿用相同真实起点，关闭全部反馈，检验反复翻转是否由反馈维持。</w:t>
       </w:r>
     </w:p>
     <w:tbl>
@@ -1938,7 +1495,7 @@
               <w:rPr>
                 <w:b/>
               </w:rPr>
-              <w:t>关闭误差反馈速度</w:t>
+              <w:t>关闭全部反馈速度</w:t>
               <w:br/>
               <w:t>峰峰值 mm/s</w:t>
             </w:r>
@@ -1980,7 +1537,7 @@
           </w:tcPr>
           <w:p>
             <w:r>
-              <w:t>1.158e-12</w:t>
+              <w:t>2.923e-35</w:t>
             </w:r>
           </w:p>
         </w:tc>
@@ -2000,7 +1557,7 @@
           </w:tcPr>
           <w:p>
             <w:r>
-              <w:t>1.158e-12</w:t>
+              <w:t>2.923e-35</w:t>
             </w:r>
           </w:p>
         </w:tc>
@@ -2032,7 +1589,7 @@
           </w:tcPr>
           <w:p>
             <w:r>
-              <w:t>0.047071</w:t>
+              <w:t>1.885973</w:t>
             </w:r>
           </w:p>
         </w:tc>
@@ -2042,7 +1599,7 @@
           </w:tcPr>
           <w:p>
             <w:r>
-              <w:t>1.218828</w:t>
+              <w:t>2.056583</w:t>
             </w:r>
           </w:p>
         </w:tc>
@@ -2052,7 +1609,7 @@
           </w:tcPr>
           <w:p>
             <w:r>
-              <w:t>8.404e-15</w:t>
+              <w:t>1.744e-33</w:t>
             </w:r>
           </w:p>
         </w:tc>
@@ -2062,7 +1619,7 @@
           </w:tcPr>
           <w:p>
             <w:r>
-              <w:t>166.67</w:t>
+              <w:t>73.35</w:t>
             </w:r>
           </w:p>
         </w:tc>
@@ -2084,7 +1641,7 @@
           </w:tcPr>
           <w:p>
             <w:r>
-              <w:t>1.112e-12</w:t>
+              <w:t>3.792e-34</w:t>
             </w:r>
           </w:p>
         </w:tc>
@@ -2094,7 +1651,7 @@
           </w:tcPr>
           <w:p>
             <w:r>
-              <w:t>5.249e-12</w:t>
+              <w:t>3.001e-34</w:t>
             </w:r>
           </w:p>
         </w:tc>
@@ -2104,7 +1661,7 @@
           </w:tcPr>
           <w:p>
             <w:r>
-              <w:t>1.160e-12</w:t>
+              <w:t>3.792e-34</w:t>
             </w:r>
           </w:p>
         </w:tc>
@@ -2122,27 +1679,206 @@
     </w:tbl>
     <w:p>
       <w:r>
-        <w:t>硬过补偿前一等长窗口速度峰峰值为 0.047071 mm/s，末段/前段幅值比为 1.0000。以相邻窗口幅值比较区分持续小幅运动与单次换向后逐渐衰减的振铃。</w:t>
+        <w:t>硬过补偿前一等长窗口速度峰峰值为 1.885973 mm/s，末段/前段幅值比为 1.0000。以相邻窗口幅值比较区分持续小幅运动与单次换向后逐渐衰减的振铃。</w:t>
       </w:r>
     </w:p>
     <w:p>
       <w:r>
-        <w:t>硬过补偿末段记录速度过零 34 次、完整同向上穿周期 16 个。频率仅在速度幅度有诊断意义且至少存在两次同向上穿时估计；采用同向插值过零周期的中位数，而不是把单次脉冲频谱当振荡频率。该保持试验与无反馈反事实共同检验本采样等效模型的小幅极限环，不能推断任意液压对象的固有模态或全局稳定性。</w:t>
+        <w:t>硬过补偿末段记录速度过零 14 次、完整同向上穿周期 6 个。频率仅在速度幅度有诊断意义且至少存在两次同向上穿时估计；采用同向插值过零周期的中位数，而不是把单次脉冲频谱当振荡频率。该保持试验与无反馈反事实共同检验本采样等效模型的小幅极限环，不能推断任意液压对象的固有模态或全局稳定性。</w:t>
       </w:r>
     </w:p>
+    <w:tbl>
+      <w:tblPr>
+        <w:tblW w:type="auto" w:w="0"/>
+        <w:tblLayout w:type="autofit"/>
+        <w:tblLook w:firstColumn="1" w:firstRow="1" w:lastColumn="0" w:lastRow="0" w:noHBand="0" w:noVBand="1" w:val="04A0"/>
+        <w:tblBorders>
+          <w:top w:val="single" w:sz="8" w:color="555555"/>
+          <w:bottom w:val="single" w:sz="8" w:color="555555"/>
+          <w:left w:val="nil" w:sz="8" w:color="555555"/>
+          <w:right w:val="nil" w:sz="8" w:color="555555"/>
+          <w:insideH w:val="nil" w:sz="8" w:color="555555"/>
+          <w:insideV w:val="nil" w:sz="8" w:color="555555"/>
+        </w:tblBorders>
+      </w:tblPr>
+      <w:tblGrid>
+        <w:gridCol w:w="3456"/>
+        <w:gridCol w:w="3456"/>
+        <w:gridCol w:w="3456"/>
+      </w:tblGrid>
+      <w:tr>
+        <w:tc>
+          <w:tcPr>
+            <w:tcW w:type="dxa" w:w="3456"/>
+            <w:tcBorders>
+              <w:bottom w:val="single" w:sz="6"/>
+            </w:tcBorders>
+          </w:tcPr>
+          <w:p>
+            <w:r>
+              <w:rPr>
+                <w:b/>
+              </w:rPr>
+              <w:t>β</w:t>
+            </w:r>
+          </w:p>
+        </w:tc>
+        <w:tc>
+          <w:tcPr>
+            <w:tcW w:type="dxa" w:w="3456"/>
+            <w:tcBorders>
+              <w:bottom w:val="single" w:sz="6"/>
+            </w:tcBorders>
+          </w:tcPr>
+          <w:p>
+            <w:r>
+              <w:rPr>
+                <w:b/>
+              </w:rPr>
+              <w:t>零参考末段速度峰峰值 / mm/s</w:t>
+            </w:r>
+          </w:p>
+        </w:tc>
+        <w:tc>
+          <w:tcPr>
+            <w:tcW w:type="dxa" w:w="3456"/>
+            <w:tcBorders>
+              <w:bottom w:val="single" w:sz="6"/>
+            </w:tcBorders>
+          </w:tcPr>
+          <w:p>
+            <w:r>
+              <w:rPr>
+                <w:b/>
+              </w:rPr>
+              <w:t>末段振荡频率 / Hz</w:t>
+            </w:r>
+          </w:p>
+        </w:tc>
+      </w:tr>
+      <w:tr>
+        <w:tc>
+          <w:tcPr>
+            <w:tcW w:type="dxa" w:w="3456"/>
+          </w:tcPr>
+          <w:p>
+            <w:r>
+              <w:t>5</w:t>
+            </w:r>
+          </w:p>
+        </w:tc>
+        <w:tc>
+          <w:tcPr>
+            <w:tcW w:type="dxa" w:w="3456"/>
+          </w:tcPr>
+          <w:p>
+            <w:r>
+              <w:t>2.822e-35</w:t>
+            </w:r>
+          </w:p>
+        </w:tc>
+        <w:tc>
+          <w:tcPr>
+            <w:tcW w:type="dxa" w:w="3456"/>
+          </w:tcPr>
+          <w:p>
+            <w:r>
+              <w:t>不报告</w:t>
+            </w:r>
+          </w:p>
+        </w:tc>
+      </w:tr>
+      <w:tr>
+        <w:tc>
+          <w:tcPr>
+            <w:tcW w:type="dxa" w:w="3456"/>
+          </w:tcPr>
+          <w:p>
+            <w:r>
+              <w:t>18</w:t>
+            </w:r>
+          </w:p>
+        </w:tc>
+        <w:tc>
+          <w:tcPr>
+            <w:tcW w:type="dxa" w:w="3456"/>
+          </w:tcPr>
+          <w:p>
+            <w:r>
+              <w:t>3.792e-34</w:t>
+            </w:r>
+          </w:p>
+        </w:tc>
+        <w:tc>
+          <w:tcPr>
+            <w:tcW w:type="dxa" w:w="3456"/>
+          </w:tcPr>
+          <w:p>
+            <w:r>
+              <w:t>不报告</w:t>
+            </w:r>
+          </w:p>
+        </w:tc>
+      </w:tr>
+      <w:tr>
+        <w:tc>
+          <w:tcPr>
+            <w:tcW w:type="dxa" w:w="3456"/>
+          </w:tcPr>
+          <w:p>
+            <w:r>
+              <w:t>50</w:t>
+            </w:r>
+          </w:p>
+        </w:tc>
+        <w:tc>
+          <w:tcPr>
+            <w:tcW w:type="dxa" w:w="3456"/>
+          </w:tcPr>
+          <w:p>
+            <w:r>
+              <w:t>1.849830</w:t>
+            </w:r>
+          </w:p>
+        </w:tc>
+        <w:tc>
+          <w:tcPr>
+            <w:tcW w:type="dxa" w:w="3456"/>
+          </w:tcPr>
+          <w:p>
+            <w:r>
+              <w:t>73.65</w:t>
+            </w:r>
+          </w:p>
+        </w:tc>
+      </w:tr>
+    </w:tbl>
     <w:p>
       <w:r>
         <w:t>补充试验检查状态：全部通过；条件及原始记录见 outputs/robustness.json。</w:t>
       </w:r>
     </w:p>
     <w:p>
+      <w:pPr>
+        <w:pStyle w:val="Heading1"/>
+      </w:pPr>
       <w:r>
-        <w:t>本模型隔离研究死区和离散反馈，不包含双腔压力、真实摩擦、负载、压差流量增益变化或传感器全动态。不能据本次速度改善推断完整液压装置的稳定性或安全性。有限 β 保留残余平台，采样与增益也会改变颤振；参数不是设备辨识值。噪声若启用，各策略共用同一序列，默认设置及 seed 均随配置保存。</w:t>
+        <w:t>5. 验证与复现</w:t>
       </w:r>
     </w:p>
     <w:p>
       <w:r>
-        <w:t>解压后进入 homework6_3：python -m pip install -r requirements.txt；python work_6_3.py；python -m unittest -v；其他独立复核命令见 README.md；python package_delivery.py。CSV 保留 N+1 个采样时刻，状态记录在本周期指令施加前，电压在随后一个采样区间保持。包内包含全部源码、配置、材料、三策略与 β 扫描 CSV、summary、validation、唯一六面板图和报告。manifest.json 记录相对路径、字节数与 SHA256；ZIP 与 manifest 自身不参与循环哈希。</w:t>
+        <w:t>本次数据与机制检查：全部通过，共51项。已记录回归测试13项。输入死区对象的解析推进以独立高精度ODE和半步等价验证；误差缓存、滤波零DC增益、保持段记忆连续及完整停反馈均单独检查。</w:t>
+      </w:r>
+    </w:p>
+    <w:p>
+      <w:r>
+        <w:t>运行：python -m pip install -r requirements.txt；python work_6_3.py；python -m unittest -v test_work_6_3.py；python package_delivery.py。CSV状态记录在当前指令作用前，u及D(u)作用于下一个Ts区间。全部代码、配置、PPT、原始CSV、报告和唯一PNG均在ZIP内，manifest列SHA256。</w:t>
+      </w:r>
+    </w:p>
+    <w:p>
+      <w:r>
+        <w:t>本版定性趋势更接近题图，但不承诺示意图的全部数值或波纹周期。它仍是公开假设下的课堂等效模型，不是完整双腔数字孪生或设备辨识结论；没有把压力安全或全局稳定性作为已验证结果。</w:t>
       </w:r>
     </w:p>
     <w:sectPr>

</xml_diff>

<commit_message>
Refine chapter 6 deadzone robustness homework and figure
</commit_message>
<xml_diff>
--- a/homework6_3/deliverables/第六章作业6-3_死区补偿报告.docx
+++ b/homework6_3/deliverables/第六章作业6-3_死区补偿报告.docx
@@ -7,7 +7,7 @@
         <w:pStyle w:val="Title"/>
       </w:pPr>
       <w:r>
-        <w:t>第六章作业6-3：死区逆补偿鲁棒性边界（修订版）</w:t>
+        <w:t>第六章作业 6-3：死区逆补偿鲁棒性边界</w:t>
       </w:r>
     </w:p>
     <w:p>
@@ -20,12 +20,12 @@
         <w:pStyle w:val="Heading1"/>
       </w:pPr>
       <w:r>
-        <w:t>1. 实验修正与共同参数</w:t>
+        <w:t>1. 共同参数与试验条件</w:t>
       </w:r>
     </w:p>
     <w:p>
       <w:r>
-        <w:t>上一版强速度比例反馈会补回死区估计失配，压缩欠补偿平台；同时把阀动态后的信号当作题图静态死区输出，削弱红色组差异。本版取消DC比例修正，改用公开的二级动态残差支路；采用输入死区接动态阀及机械速度的课堂等效模型。不是只调整坐标或对结果添加振荡。</w:t>
+        <w:t>三组使用相同的输入死区、动态有效阀口和机械速度课堂约化模型。共同的二级动态残差支路使硬逆映射的换向敏感性可在采样闭环中检验；三组只改变死区估计或补偿函数。曲线来自实际状态推进，没有注入预设振荡。</w:t>
       </w:r>
     </w:p>
     <w:tbl>
@@ -229,7 +229,7 @@
           </w:tcPr>
           <w:p>
             <w:r>
-              <w:t>Kw=17，两级τw=2 ms</w:t>
+              <w:t>Kw=20，两级τw=2 ms</w:t>
             </w:r>
           </w:p>
         </w:tc>
@@ -251,7 +251,7 @@
           </w:tcPr>
           <w:p>
             <w:r>
-              <w:t>6采样，前馈不延迟</w:t>
+              <w:t>8采样，前馈不延迟</w:t>
             </w:r>
           </w:p>
         </w:tc>
@@ -321,7 +321,7 @@
     </w:p>
     <w:p>
       <w:r>
-        <w:t>e[k]=(vd[k]−v_meas[k])/Kv；ed=e[k−d]；a=exp(−Ts/τw)。按采样顺序：L1[k]=aL1[k−1]+(1−a)ed；h1=ed−L1[k]；L2[k]=aL2[k−1]+(1−a)h1；h2=h1−L2[k]。u_lin=(vd+τm·ad)/Kv+Kw·h2。两级washout的DC增益为零，因此不会像旧Kp=4那样补平慢变死区失配；它对动态残差和采样延迟敏感，用来测试硬逆函数的鲁棒性。</w:t>
+        <w:t>e[k]=(vd[k]−v_meas[k])/Kv；ed=e[k−d]；a=exp(−Ts/τw)。按采样顺序：L1[k]=aL1[k−1]+(1−a)ed；h1=ed−L1[k]；L2[k]=aL2[k−1]+(1−a)h1；h2=h1−L2[k]。u_lin=(vd+τm·ad)/Kv+Kw·h2。两级 washout 的 DC 增益为零，故保留慢变死区估计失配；它对动态残差和采样延迟敏感，用来测试硬逆函数的鲁棒性。</w:t>
       </w:r>
     </w:p>
     <w:p>
@@ -339,7 +339,7 @@
     </w:p>
     <w:p>
       <w:r>
-        <w:t>换向窗口4.55–5.45s。有效信号零平台通过|u|≤δ的采样阈值重建统计；近零速度另外按|v|≤0.5mm/s统计。两者不等同，不能将示意图约110ms的近零速度外观强称为精确零流量时长。</w:t>
+        <w:t>换向窗口4.55–5.45s。有效信号零平台通过|u|≤δ的采样阈值重建统计；近零速度另外按|v|≤0.5mm/s统计。两者不等同。给定5 V、0.1 Hz和0.10 V残余静态死区时平台约为63.67 ms；示意图标注的约110 ms不作为本次实测值。</w:t>
       </w:r>
     </w:p>
     <w:p>
@@ -450,7 +450,7 @@
           </w:tcPr>
           <w:p>
             <w:r>
-              <w:t>63.620</w:t>
+              <w:t>63.602</w:t>
             </w:r>
           </w:p>
         </w:tc>
@@ -470,7 +470,7 @@
           </w:tcPr>
           <w:p>
             <w:r>
-              <w:t>28.621</w:t>
+              <w:t>27.227</w:t>
             </w:r>
           </w:p>
         </w:tc>
@@ -492,7 +492,7 @@
           </w:tcPr>
           <w:p>
             <w:r>
-              <w:t>95.424</w:t>
+              <w:t>95.367</w:t>
             </w:r>
           </w:p>
         </w:tc>
@@ -502,7 +502,7 @@
           </w:tcPr>
           <w:p>
             <w:r>
-              <w:t>7.117</w:t>
+              <w:t>14.899</w:t>
             </w:r>
           </w:p>
         </w:tc>
@@ -512,7 +512,7 @@
           </w:tcPr>
           <w:p>
             <w:r>
-              <w:t>35.402</w:t>
+              <w:t>35.374</w:t>
             </w:r>
           </w:p>
         </w:tc>
@@ -544,7 +544,7 @@
           </w:tcPr>
           <w:p>
             <w:r>
-              <w:t>2.0906</w:t>
+              <w:t>2.5446</w:t>
             </w:r>
           </w:p>
         </w:tc>
@@ -554,7 +554,7 @@
           </w:tcPr>
           <w:p>
             <w:r>
-              <w:t>0.3124</w:t>
+              <w:t>0.3608</w:t>
             </w:r>
           </w:p>
         </w:tc>
@@ -576,7 +576,7 @@
           </w:tcPr>
           <w:p>
             <w:r>
-              <w:t>0.0409</w:t>
+              <w:t>0.0420</w:t>
             </w:r>
           </w:p>
         </w:tc>
@@ -586,7 +586,7 @@
           </w:tcPr>
           <w:p>
             <w:r>
-              <w:t>1.2898</w:t>
+              <w:t>2.6919</w:t>
             </w:r>
           </w:p>
         </w:tc>
@@ -596,7 +596,7 @@
           </w:tcPr>
           <w:p>
             <w:r>
-              <w:t>0.2850</w:t>
+              <w:t>0.3812</w:t>
             </w:r>
           </w:p>
         </w:tc>
@@ -628,7 +628,7 @@
           </w:tcPr>
           <w:p>
             <w:r>
-              <w:t>12.0178</w:t>
+              <w:t>62.5601</w:t>
             </w:r>
           </w:p>
         </w:tc>
@@ -638,7 +638,7 @@
           </w:tcPr>
           <w:p>
             <w:r>
-              <w:t>0.0598</w:t>
+              <w:t>0.5838</w:t>
             </w:r>
           </w:p>
         </w:tc>
@@ -670,7 +670,7 @@
           </w:tcPr>
           <w:p>
             <w:r>
-              <w:t>13</w:t>
+              <w:t>23</w:t>
             </w:r>
           </w:p>
         </w:tc>
@@ -702,7 +702,7 @@
           </w:tcPr>
           <w:p>
             <w:r>
-              <w:t>0.99562</w:t>
+              <w:t>0.99567</w:t>
             </w:r>
           </w:p>
         </w:tc>
@@ -712,7 +712,7 @@
           </w:tcPr>
           <w:p>
             <w:r>
-              <w:t>0.99612</w:t>
+              <w:t>0.99957</w:t>
             </w:r>
           </w:p>
         </w:tc>
@@ -722,7 +722,7 @@
           </w:tcPr>
           <w:p>
             <w:r>
-              <w:t>0.99157</w:t>
+              <w:t>0.99159</w:t>
             </w:r>
           </w:p>
         </w:tc>
@@ -816,7 +816,7 @@
       <w:r>
         <w:drawing>
           <wp:inline xmlns:a="http://schemas.openxmlformats.org/drawingml/2006/main" xmlns:pic="http://schemas.openxmlformats.org/drawingml/2006/picture">
-            <wp:extent cx="6583680" cy="3890356"/>
+            <wp:extent cx="6583680" cy="3448594"/>
             <wp:docPr id="1" name="Picture 1"/>
             <wp:cNvGraphicFramePr>
               <a:graphicFrameLocks noChangeAspect="1"/>
@@ -837,7 +837,7 @@
                   <pic:spPr>
                     <a:xfrm>
                       <a:off x="0" y="0"/>
-                      <a:ext cx="6583680" cy="3890356"/>
+                      <a:ext cx="6583680" cy="3448594"/>
                     </a:xfrm>
                     <a:prstGeom prst="rect"/>
                   </pic:spPr>
@@ -850,7 +850,7 @@
     </w:p>
     <w:p>
       <w:r>
-        <w:t>图1：只画原始闭环记录，左列全周期(a1–a3)，右列换向局部(b1–b3)。主图中有效信号是D(u)，动态阀口状态另存CSV。硬补偿本身有跳变，图示蓝线不能被描述为数学上连续的精确硬逆函数。</w:t>
+        <w:t>图 1：直接绘制原始闭环记录；左列为全周期 (a1–a3)，右列为换向局部 (b1–b3)。图中有效信号为 D(u)，动态阀口状态另存 CSV。两组硬符号逆映射在零点均不连续。</w:t>
       </w:r>
     </w:p>
     <w:p>
@@ -998,7 +998,7 @@
           </w:tcPr>
           <w:p>
             <w:r>
-              <w:t>87.454</w:t>
+              <w:t>87.302</w:t>
             </w:r>
           </w:p>
         </w:tc>
@@ -1008,7 +1008,7 @@
           </w:tcPr>
           <w:p>
             <w:r>
-              <w:t>96.965</w:t>
+              <w:t>97.202</w:t>
             </w:r>
           </w:p>
         </w:tc>
@@ -1018,7 +1018,7 @@
           </w:tcPr>
           <w:p>
             <w:r>
-              <w:t>0.1935</w:t>
+              <w:t>0.3669</w:t>
             </w:r>
           </w:p>
         </w:tc>
@@ -1028,7 +1028,7 @@
           </w:tcPr>
           <w:p>
             <w:r>
-              <w:t>0.3212</w:t>
+              <w:t>0.7281</w:t>
             </w:r>
           </w:p>
         </w:tc>
@@ -1060,7 +1060,7 @@
           </w:tcPr>
           <w:p>
             <w:r>
-              <w:t>28.621</w:t>
+              <w:t>27.227</w:t>
             </w:r>
           </w:p>
         </w:tc>
@@ -1070,7 +1070,7 @@
           </w:tcPr>
           <w:p>
             <w:r>
-              <w:t>35.402</w:t>
+              <w:t>35.374</w:t>
             </w:r>
           </w:p>
         </w:tc>
@@ -1080,7 +1080,7 @@
           </w:tcPr>
           <w:p>
             <w:r>
-              <w:t>0.3124</w:t>
+              <w:t>0.3608</w:t>
             </w:r>
           </w:p>
         </w:tc>
@@ -1090,7 +1090,7 @@
           </w:tcPr>
           <w:p>
             <w:r>
-              <w:t>0.2850</w:t>
+              <w:t>0.3812</w:t>
             </w:r>
           </w:p>
         </w:tc>
@@ -1100,7 +1100,7 @@
           </w:tcPr>
           <w:p>
             <w:r>
-              <w:t>0.99157</w:t>
+              <w:t>0.99159</w:t>
             </w:r>
           </w:p>
         </w:tc>
@@ -1122,7 +1122,7 @@
           </w:tcPr>
           <w:p>
             <w:r>
-              <w:t>10.770</w:t>
+              <w:t>7.135</w:t>
             </w:r>
           </w:p>
         </w:tc>
@@ -1132,7 +1132,7 @@
           </w:tcPr>
           <w:p>
             <w:r>
-              <w:t>15.506</w:t>
+              <w:t>9.092</w:t>
             </w:r>
           </w:p>
         </w:tc>
@@ -1142,7 +1142,7 @@
           </w:tcPr>
           <w:p>
             <w:r>
-              <w:t>0.7926</w:t>
+              <w:t>1.0944</w:t>
             </w:r>
           </w:p>
         </w:tc>
@@ -1152,7 +1152,7 @@
           </w:tcPr>
           <w:p>
             <w:r>
-              <w:t>0.4308</w:t>
+              <w:t>0.8062</w:t>
             </w:r>
           </w:p>
         </w:tc>
@@ -1162,7 +1162,7 @@
           </w:tcPr>
           <w:p>
             <w:r>
-              <w:t>0.99646</w:t>
+              <w:t>0.99624</w:t>
             </w:r>
           </w:p>
         </w:tc>
@@ -1294,7 +1294,7 @@
           </w:tcPr>
           <w:p>
             <w:r>
-              <w:t>71.607</w:t>
+              <w:t>81.323</w:t>
             </w:r>
           </w:p>
         </w:tc>
@@ -1304,7 +1304,7 @@
           </w:tcPr>
           <w:p>
             <w:r>
-              <w:t>0.74592</w:t>
+              <w:t>0.58327</w:t>
             </w:r>
           </w:p>
         </w:tc>
@@ -1314,7 +1314,7 @@
           </w:tcPr>
           <w:p>
             <w:r>
-              <w:t>0.98052</w:t>
+              <w:t>0.98154</w:t>
             </w:r>
           </w:p>
         </w:tc>
@@ -1336,7 +1336,7 @@
           </w:tcPr>
           <w:p>
             <w:r>
-              <w:t>7.946</w:t>
+              <w:t>5.347</w:t>
             </w:r>
           </w:p>
         </w:tc>
@@ -1346,7 +1346,7 @@
           </w:tcPr>
           <w:p>
             <w:r>
-              <w:t>1.10218</w:t>
+              <w:t>2.09858</w:t>
             </w:r>
           </w:p>
         </w:tc>
@@ -1356,7 +1356,7 @@
           </w:tcPr>
           <w:p>
             <w:r>
-              <w:t>0.99193</w:t>
+              <w:t>0.99191</w:t>
             </w:r>
           </w:p>
         </w:tc>
@@ -1378,7 +1378,7 @@
           </w:tcPr>
           <w:p>
             <w:r>
-              <w:t>2.457</w:t>
+              <w:t>3.910</w:t>
             </w:r>
           </w:p>
         </w:tc>
@@ -1388,7 +1388,7 @@
           </w:tcPr>
           <w:p>
             <w:r>
-              <w:t>1.54286</w:t>
+              <w:t>1.97990</w:t>
             </w:r>
           </w:p>
         </w:tc>
@@ -1398,7 +1398,7 @@
           </w:tcPr>
           <w:p>
             <w:r>
-              <w:t>0.99662</w:t>
+              <w:t>0.99614</w:t>
             </w:r>
           </w:p>
         </w:tc>
@@ -1589,7 +1589,7 @@
           </w:tcPr>
           <w:p>
             <w:r>
-              <w:t>1.885973</w:t>
+              <w:t>4.697391</w:t>
             </w:r>
           </w:p>
         </w:tc>
@@ -1599,7 +1599,7 @@
           </w:tcPr>
           <w:p>
             <w:r>
-              <w:t>2.056583</w:t>
+              <w:t>3.283269</w:t>
             </w:r>
           </w:p>
         </w:tc>
@@ -1609,7 +1609,7 @@
           </w:tcPr>
           <w:p>
             <w:r>
-              <w:t>1.744e-33</w:t>
+              <w:t>7.015e-34</w:t>
             </w:r>
           </w:p>
         </w:tc>
@@ -1619,7 +1619,7 @@
           </w:tcPr>
           <w:p>
             <w:r>
-              <w:t>73.35</w:t>
+              <w:t>61.53</w:t>
             </w:r>
           </w:p>
         </w:tc>
@@ -1641,7 +1641,7 @@
           </w:tcPr>
           <w:p>
             <w:r>
-              <w:t>3.792e-34</w:t>
+              <w:t>3.791e-34</w:t>
             </w:r>
           </w:p>
         </w:tc>
@@ -1651,7 +1651,7 @@
           </w:tcPr>
           <w:p>
             <w:r>
-              <w:t>3.001e-34</w:t>
+              <w:t>4.169e-34</w:t>
             </w:r>
           </w:p>
         </w:tc>
@@ -1661,7 +1661,7 @@
           </w:tcPr>
           <w:p>
             <w:r>
-              <w:t>3.792e-34</w:t>
+              <w:t>3.791e-34</w:t>
             </w:r>
           </w:p>
         </w:tc>
@@ -1679,12 +1679,12 @@
     </w:tbl>
     <w:p>
       <w:r>
-        <w:t>硬过补偿前一等长窗口速度峰峰值为 1.885973 mm/s，末段/前段幅值比为 1.0000。以相邻窗口幅值比较区分持续小幅运动与单次换向后逐渐衰减的振铃。</w:t>
+        <w:t>硬过补偿前一等长窗口速度峰峰值为 4.726081 mm/s，末段/前段幅值比为 0.9939。以相邻窗口幅值比较区分持续小幅运动与单次换向后逐渐衰减的振铃。</w:t>
       </w:r>
     </w:p>
     <w:p>
       <w:r>
-        <w:t>硬过补偿末段记录速度过零 14 次、完整同向上穿周期 6 个。频率仅在速度幅度有诊断意义且至少存在两次同向上穿时估计；采用同向插值过零周期的中位数，而不是把单次脉冲频谱当振荡频率。该保持试验与无反馈反事实共同检验本采样等效模型的小幅极限环，不能推断任意液压对象的固有模态或全局稳定性。</w:t>
+        <w:t>硬过补偿末段记录速度过零 12 次、完整同向上穿周期 5 个。频率仅在速度幅度有诊断意义且至少存在两次同向上穿时估计；采用同向插值过零周期的中位数，而不是把单次脉冲频谱当振荡频率。该保持试验与无反馈反事实共同检验本采样等效模型的小幅极限环，不能推断任意液压对象的固有模态或全局稳定性。</w:t>
       </w:r>
     </w:p>
     <w:tbl>
@@ -1773,7 +1773,7 @@
           </w:tcPr>
           <w:p>
             <w:r>
-              <w:t>2.822e-35</w:t>
+              <w:t>2.848e-35</w:t>
             </w:r>
           </w:p>
         </w:tc>
@@ -1805,7 +1805,7 @@
           </w:tcPr>
           <w:p>
             <w:r>
-              <w:t>3.792e-34</w:t>
+              <w:t>3.791e-34</w:t>
             </w:r>
           </w:p>
         </w:tc>
@@ -1837,7 +1837,7 @@
           </w:tcPr>
           <w:p>
             <w:r>
-              <w:t>1.849830</w:t>
+              <w:t>4.651771</w:t>
             </w:r>
           </w:p>
         </w:tc>
@@ -1847,7 +1847,7 @@
           </w:tcPr>
           <w:p>
             <w:r>
-              <w:t>73.65</w:t>
+              <w:t>61.42</w:t>
             </w:r>
           </w:p>
         </w:tc>
@@ -1868,7 +1868,7 @@
     </w:p>
     <w:p>
       <w:r>
-        <w:t>本次数据与机制检查：全部通过，共51项。已记录回归测试13项。输入死区对象的解析推进以独立高精度ODE和半步等价验证；误差缓存、滤波零DC增益、保持段记忆连续及完整停反馈均单独检查。</w:t>
+        <w:t>本次数据与机制检查：全部通过，共 51 项。另有 13 项单元测试，日志见 outputs/unit_tests.txt。输入死区对象的解析推进以独立高精度 ODE 和半步等价验证；误差缓存、滤波零 DC 增益、保持段记忆连续及完整停反馈均单独检查。</w:t>
       </w:r>
     </w:p>
     <w:p>
@@ -1878,7 +1878,7 @@
     </w:p>
     <w:p>
       <w:r>
-        <w:t>本版定性趋势更接近题图，但不承诺示意图的全部数值或波纹周期。它仍是公开假设下的课堂等效模型，不是完整双腔数字孪生或设备辨识结论；没有把压力安全或全局稳定性作为已验证结果。</w:t>
+        <w:t>图中三类失配现象均由公开参数下的课堂等效模型计算，示意图数值及波纹周期不作为硬编码目标。该模型不是完整双腔数字孪生或设备辨识结论；压力安全和全局稳定性不在本实验验证范围内。</w:t>
       </w:r>
     </w:p>
     <w:sectPr>

</xml_diff>

<commit_message>
Refine homework 6-3 hard-overlap chatter timing
</commit_message>
<xml_diff>
--- a/homework6_3/deliverables/第六章作业6-3_死区补偿报告.docx
+++ b/homework6_3/deliverables/第六章作业6-3_死区补偿报告.docx
@@ -229,7 +229,7 @@
           </w:tcPr>
           <w:p>
             <w:r>
-              <w:t>Kw=20，两级τw=2 ms</w:t>
+              <w:t>Kw=30，两级τw=1.5 ms</w:t>
             </w:r>
           </w:p>
         </w:tc>
@@ -251,7 +251,7 @@
           </w:tcPr>
           <w:p>
             <w:r>
-              <w:t>8采样，前馈不延迟</w:t>
+              <w:t>2采样，前馈不延迟</w:t>
             </w:r>
           </w:p>
         </w:tc>
@@ -450,7 +450,7 @@
           </w:tcPr>
           <w:p>
             <w:r>
-              <w:t>63.602</w:t>
+              <w:t>63.640</w:t>
             </w:r>
           </w:p>
         </w:tc>
@@ -470,7 +470,7 @@
           </w:tcPr>
           <w:p>
             <w:r>
-              <w:t>27.227</w:t>
+              <w:t>29.466</w:t>
             </w:r>
           </w:p>
         </w:tc>
@@ -492,7 +492,7 @@
           </w:tcPr>
           <w:p>
             <w:r>
-              <w:t>95.367</w:t>
+              <w:t>95.209</w:t>
             </w:r>
           </w:p>
         </w:tc>
@@ -502,7 +502,7 @@
           </w:tcPr>
           <w:p>
             <w:r>
-              <w:t>14.899</w:t>
+              <w:t>14.313</w:t>
             </w:r>
           </w:p>
         </w:tc>
@@ -512,7 +512,7 @@
           </w:tcPr>
           <w:p>
             <w:r>
-              <w:t>35.374</w:t>
+              <w:t>35.386</w:t>
             </w:r>
           </w:p>
         </w:tc>
@@ -534,7 +534,7 @@
           </w:tcPr>
           <w:p>
             <w:r>
-              <w:t>0.7671</w:t>
+              <w:t>0.7672</w:t>
             </w:r>
           </w:p>
         </w:tc>
@@ -544,7 +544,7 @@
           </w:tcPr>
           <w:p>
             <w:r>
-              <w:t>2.5446</w:t>
+              <w:t>2.0729</w:t>
             </w:r>
           </w:p>
         </w:tc>
@@ -554,7 +554,7 @@
           </w:tcPr>
           <w:p>
             <w:r>
-              <w:t>0.3608</w:t>
+              <w:t>0.6546</w:t>
             </w:r>
           </w:p>
         </w:tc>
@@ -576,7 +576,7 @@
           </w:tcPr>
           <w:p>
             <w:r>
-              <w:t>0.0420</w:t>
+              <w:t>0.0407</w:t>
             </w:r>
           </w:p>
         </w:tc>
@@ -586,7 +586,7 @@
           </w:tcPr>
           <w:p>
             <w:r>
-              <w:t>2.6919</w:t>
+              <w:t>0.6196</w:t>
             </w:r>
           </w:p>
         </w:tc>
@@ -596,7 +596,7 @@
           </w:tcPr>
           <w:p>
             <w:r>
-              <w:t>0.3812</w:t>
+              <w:t>0.3963</w:t>
             </w:r>
           </w:p>
         </w:tc>
@@ -628,7 +628,7 @@
           </w:tcPr>
           <w:p>
             <w:r>
-              <w:t>62.5601</w:t>
+              <w:t>7.0442</w:t>
             </w:r>
           </w:p>
         </w:tc>
@@ -638,7 +638,7 @@
           </w:tcPr>
           <w:p>
             <w:r>
-              <w:t>0.5838</w:t>
+              <w:t>1.6659</w:t>
             </w:r>
           </w:p>
         </w:tc>
@@ -670,7 +670,7 @@
           </w:tcPr>
           <w:p>
             <w:r>
-              <w:t>23</w:t>
+              <w:t>21</w:t>
             </w:r>
           </w:p>
         </w:tc>
@@ -702,7 +702,7 @@
           </w:tcPr>
           <w:p>
             <w:r>
-              <w:t>0.99567</w:t>
+              <w:t>0.99557</w:t>
             </w:r>
           </w:p>
         </w:tc>
@@ -712,7 +712,7 @@
           </w:tcPr>
           <w:p>
             <w:r>
-              <w:t>0.99957</w:t>
+              <w:t>0.99583</w:t>
             </w:r>
           </w:p>
         </w:tc>
@@ -722,7 +722,7 @@
           </w:tcPr>
           <w:p>
             <w:r>
-              <w:t>0.99159</w:t>
+              <w:t>0.99092</w:t>
             </w:r>
           </w:p>
         </w:tc>
@@ -812,6 +812,11 @@
         </w:tc>
       </w:tr>
     </w:tbl>
+    <w:p>
+      <w:r>
+        <w:t>硬过补偿在放大窗口中的线性指令共发生 21 次符号切换，首末切换分别位于 4.988 s 与 5.057 s。相邻切换间隔中位数换算的完整往复频率约为 147.6 Hz；这是该采样闭环的观测切换频率，不代表液压对象的固有频率。</w:t>
+      </w:r>
+    </w:p>
     <w:p>
       <w:r>
         <w:drawing>
@@ -998,7 +1003,7 @@
           </w:tcPr>
           <w:p>
             <w:r>
-              <w:t>87.302</w:t>
+              <w:t>87.573</w:t>
             </w:r>
           </w:p>
         </w:tc>
@@ -1008,7 +1013,7 @@
           </w:tcPr>
           <w:p>
             <w:r>
-              <w:t>97.202</w:t>
+              <w:t>96.602</w:t>
             </w:r>
           </w:p>
         </w:tc>
@@ -1018,7 +1023,7 @@
           </w:tcPr>
           <w:p>
             <w:r>
-              <w:t>0.3669</w:t>
+              <w:t>0.8276</w:t>
             </w:r>
           </w:p>
         </w:tc>
@@ -1028,7 +1033,7 @@
           </w:tcPr>
           <w:p>
             <w:r>
-              <w:t>0.7281</w:t>
+              <w:t>0.5624</w:t>
             </w:r>
           </w:p>
         </w:tc>
@@ -1038,7 +1043,7 @@
           </w:tcPr>
           <w:p>
             <w:r>
-              <w:t>0.98241</w:t>
+              <w:t>0.98096</w:t>
             </w:r>
           </w:p>
         </w:tc>
@@ -1060,7 +1065,7 @@
           </w:tcPr>
           <w:p>
             <w:r>
-              <w:t>27.227</w:t>
+              <w:t>29.466</w:t>
             </w:r>
           </w:p>
         </w:tc>
@@ -1070,7 +1075,7 @@
           </w:tcPr>
           <w:p>
             <w:r>
-              <w:t>35.374</w:t>
+              <w:t>35.386</w:t>
             </w:r>
           </w:p>
         </w:tc>
@@ -1080,7 +1085,7 @@
           </w:tcPr>
           <w:p>
             <w:r>
-              <w:t>0.3608</w:t>
+              <w:t>0.6546</w:t>
             </w:r>
           </w:p>
         </w:tc>
@@ -1090,7 +1095,7 @@
           </w:tcPr>
           <w:p>
             <w:r>
-              <w:t>0.3812</w:t>
+              <w:t>0.3963</w:t>
             </w:r>
           </w:p>
         </w:tc>
@@ -1100,7 +1105,7 @@
           </w:tcPr>
           <w:p>
             <w:r>
-              <w:t>0.99159</w:t>
+              <w:t>0.99092</w:t>
             </w:r>
           </w:p>
         </w:tc>
@@ -1122,7 +1127,7 @@
           </w:tcPr>
           <w:p>
             <w:r>
-              <w:t>7.135</w:t>
+              <w:t>6.960</w:t>
             </w:r>
           </w:p>
         </w:tc>
@@ -1132,7 +1137,7 @@
           </w:tcPr>
           <w:p>
             <w:r>
-              <w:t>9.092</w:t>
+              <w:t>14.244</w:t>
             </w:r>
           </w:p>
         </w:tc>
@@ -1142,7 +1147,7 @@
           </w:tcPr>
           <w:p>
             <w:r>
-              <w:t>1.0944</w:t>
+              <w:t>1.4876</w:t>
             </w:r>
           </w:p>
         </w:tc>
@@ -1152,7 +1157,7 @@
           </w:tcPr>
           <w:p>
             <w:r>
-              <w:t>0.8062</w:t>
+              <w:t>0.3242</w:t>
             </w:r>
           </w:p>
         </w:tc>
@@ -1162,7 +1167,7 @@
           </w:tcPr>
           <w:p>
             <w:r>
-              <w:t>0.99624</w:t>
+              <w:t>0.99576</w:t>
             </w:r>
           </w:p>
         </w:tc>
@@ -1294,7 +1299,7 @@
           </w:tcPr>
           <w:p>
             <w:r>
-              <w:t>81.323</w:t>
+              <w:t>69.005</w:t>
             </w:r>
           </w:p>
         </w:tc>
@@ -1304,7 +1309,7 @@
           </w:tcPr>
           <w:p>
             <w:r>
-              <w:t>0.58327</w:t>
+              <w:t>1.13516</w:t>
             </w:r>
           </w:p>
         </w:tc>
@@ -1314,7 +1319,7 @@
           </w:tcPr>
           <w:p>
             <w:r>
-              <w:t>0.98154</w:t>
+              <w:t>0.97848</w:t>
             </w:r>
           </w:p>
         </w:tc>
@@ -1336,7 +1341,7 @@
           </w:tcPr>
           <w:p>
             <w:r>
-              <w:t>5.347</w:t>
+              <w:t>13.624</w:t>
             </w:r>
           </w:p>
         </w:tc>
@@ -1346,7 +1351,7 @@
           </w:tcPr>
           <w:p>
             <w:r>
-              <w:t>2.09858</w:t>
+              <w:t>1.62318</w:t>
             </w:r>
           </w:p>
         </w:tc>
@@ -1356,7 +1361,7 @@
           </w:tcPr>
           <w:p>
             <w:r>
-              <w:t>0.99191</w:t>
+              <w:t>0.99127</w:t>
             </w:r>
           </w:p>
         </w:tc>
@@ -1378,7 +1383,7 @@
           </w:tcPr>
           <w:p>
             <w:r>
-              <w:t>3.910</w:t>
+              <w:t>2.638</w:t>
             </w:r>
           </w:p>
         </w:tc>
@@ -1388,7 +1393,7 @@
           </w:tcPr>
           <w:p>
             <w:r>
-              <w:t>1.97990</w:t>
+              <w:t>2.02078</w:t>
             </w:r>
           </w:p>
         </w:tc>
@@ -1398,7 +1403,7 @@
           </w:tcPr>
           <w:p>
             <w:r>
-              <w:t>0.99614</w:t>
+              <w:t>0.99488</w:t>
             </w:r>
           </w:p>
         </w:tc>
@@ -1589,7 +1594,7 @@
           </w:tcPr>
           <w:p>
             <w:r>
-              <w:t>4.697391</w:t>
+              <w:t>0.586951</w:t>
             </w:r>
           </w:p>
         </w:tc>
@@ -1599,7 +1604,7 @@
           </w:tcPr>
           <w:p>
             <w:r>
-              <w:t>3.283269</w:t>
+              <w:t>1.754418</w:t>
             </w:r>
           </w:p>
         </w:tc>
@@ -1609,7 +1614,7 @@
           </w:tcPr>
           <w:p>
             <w:r>
-              <w:t>7.015e-34</w:t>
+              <w:t>8.571e-34</w:t>
             </w:r>
           </w:p>
         </w:tc>
@@ -1619,7 +1624,7 @@
           </w:tcPr>
           <w:p>
             <w:r>
-              <w:t>61.53</w:t>
+              <w:t>142.86</w:t>
             </w:r>
           </w:p>
         </w:tc>
@@ -1641,7 +1646,7 @@
           </w:tcPr>
           <w:p>
             <w:r>
-              <w:t>3.791e-34</w:t>
+              <w:t>3.897e-34</w:t>
             </w:r>
           </w:p>
         </w:tc>
@@ -1651,7 +1656,7 @@
           </w:tcPr>
           <w:p>
             <w:r>
-              <w:t>4.169e-34</w:t>
+              <w:t>1.661e-34</w:t>
             </w:r>
           </w:p>
         </w:tc>
@@ -1661,7 +1666,7 @@
           </w:tcPr>
           <w:p>
             <w:r>
-              <w:t>3.791e-34</w:t>
+              <w:t>3.897e-34</w:t>
             </w:r>
           </w:p>
         </w:tc>
@@ -1679,12 +1684,12 @@
     </w:tbl>
     <w:p>
       <w:r>
-        <w:t>硬过补偿前一等长窗口速度峰峰值为 4.726081 mm/s，末段/前段幅值比为 0.9939。以相邻窗口幅值比较区分持续小幅运动与单次换向后逐渐衰减的振铃。</w:t>
+        <w:t>硬过补偿前一等长窗口速度峰峰值为 0.586951 mm/s，末段/前段幅值比为 1.0000。以相邻窗口幅值比较区分持续小幅运动与单次换向后逐渐衰减的振铃。</w:t>
       </w:r>
     </w:p>
     <w:p>
       <w:r>
-        <w:t>硬过补偿末段记录速度过零 12 次、完整同向上穿周期 5 个。频率仅在速度幅度有诊断意义且至少存在两次同向上穿时估计；采用同向插值过零周期的中位数，而不是把单次脉冲频谱当振荡频率。该保持试验与无反馈反事实共同检验本采样等效模型的小幅极限环，不能推断任意液压对象的固有模态或全局稳定性。</w:t>
+        <w:t>硬过补偿末段记录速度过零 29 次、完整同向上穿周期 13 个。频率仅在速度幅度有诊断意义且至少存在两次同向上穿时估计；采用同向插值过零周期的中位数，而不是把单次脉冲频谱当振荡频率。该保持试验与无反馈反事实共同检验本采样等效模型的小幅极限环，不能推断任意液压对象的固有模态或全局稳定性。</w:t>
       </w:r>
     </w:p>
     <w:tbl>
@@ -1773,7 +1778,7 @@
           </w:tcPr>
           <w:p>
             <w:r>
-              <w:t>2.848e-35</w:t>
+              <w:t>2.803e-35</w:t>
             </w:r>
           </w:p>
         </w:tc>
@@ -1805,7 +1810,7 @@
           </w:tcPr>
           <w:p>
             <w:r>
-              <w:t>3.791e-34</w:t>
+              <w:t>3.897e-34</w:t>
             </w:r>
           </w:p>
         </w:tc>
@@ -1837,7 +1842,7 @@
           </w:tcPr>
           <w:p>
             <w:r>
-              <w:t>4.651771</w:t>
+              <w:t>0.572373</w:t>
             </w:r>
           </w:p>
         </w:tc>
@@ -1847,7 +1852,7 @@
           </w:tcPr>
           <w:p>
             <w:r>
-              <w:t>61.42</w:t>
+              <w:t>142.86</w:t>
             </w:r>
           </w:p>
         </w:tc>
@@ -1868,7 +1873,7 @@
     </w:p>
     <w:p>
       <w:r>
-        <w:t>本次数据与机制检查：全部通过，共 51 项。另有 13 项单元测试，日志见 outputs/unit_tests.txt。输入死区对象的解析推进以独立高精度 ODE 和半步等价验证；误差缓存、滤波零 DC 增益、保持段记忆连续及完整停反馈均单独检查。</w:t>
+        <w:t>本次数据与机制检查：全部通过，共 51 项。另有 14 项单元测试通过，日志见 outputs/unit_tests.txt。输入死区对象的解析推进以独立高精度 ODE 和半步等价验证；误差缓存、滤波零 DC 增益、保持段记忆连续及完整停反馈均单独检查。</w:t>
       </w:r>
     </w:p>
     <w:p>

</xml_diff>